<commit_message>
added more objects to rmd
</commit_message>
<xml_diff>
--- a/module2_rmd1.docx
+++ b/module2_rmd1.docx
@@ -88,7 +88,7 @@
         </w:pict>
       </w:r>
     </w:p>
-    <w:bookmarkStart w:id="23" w:name="this-is-a-level-1-header"/>
+    <w:bookmarkStart w:id="30" w:name="this-is-a-level-1-header"/>
     <w:p>
       <w:pPr>
         <w:pStyle w:val="Heading1"/>
@@ -730,7 +730,48 @@
         <w:rPr>
           <w:rStyle w:val="NormalTok"/>
         </w:rPr>
-        <w:t xml:space="preserve">(cars))</w:t>
+        <w:t xml:space="preserve">(cars),</w:t>
+      </w:r>
+      <w:r>
+        <w:br/>
+      </w:r>
+      <w:r>
+        <w:rPr>
+          <w:rStyle w:val="NormalTok"/>
+        </w:rPr>
+        <w:t xml:space="preserve">             </w:t>
+      </w:r>
+      <w:r>
+        <w:rPr>
+          <w:rStyle w:val="AttributeTok"/>
+        </w:rPr>
+        <w:t xml:space="preserve">caption =</w:t>
+      </w:r>
+      <w:r>
+        <w:rPr>
+          <w:rStyle w:val="NormalTok"/>
+        </w:rPr>
+        <w:t xml:space="preserve"> </w:t>
+      </w:r>
+      <w:r>
+        <w:rPr>
+          <w:rStyle w:val="StringTok"/>
+        </w:rPr>
+        <w:t xml:space="preserve">"Top 6 Rows of Cars Dataset"</w:t>
+      </w:r>
+      <w:r>
+        <w:rPr>
+          <w:rStyle w:val="NormalTok"/>
+        </w:rPr>
+        <w:t xml:space="preserve">)</w:t>
+      </w:r>
+    </w:p>
+    <w:p>
+      <w:pPr>
+        <w:pStyle w:val="TableCaption"/>
+      </w:pPr>
+      <w:r>
+        <w:t xml:space="preserve">Top 6 Rows of Cars Dataset</w:t>
       </w:r>
     </w:p>
     <w:tbl>
@@ -738,6 +779,7 @@
         <w:tblStyle w:val="Table"/>
         <w:tblW w:type="auto" w:w="0"/>
         <w:tblLook w:firstRow="1" w:lastRow="0" w:firstColumn="0" w:lastColumn="0" w:noHBand="0" w:noVBand="0" w:val="0020"/>
+        <w:tblCaption w:val="Top 6 Rows of Cars Dataset"/>
       </w:tblPr>
       <w:tblGrid>
         <w:gridCol w:w="3960"/>
@@ -930,7 +972,784 @@
       </w:tr>
     </w:tbl>
     <w:bookmarkEnd w:id="22"/>
+    <w:bookmarkStart w:id="23" w:name="inset-an-equation"/>
+    <w:p>
+      <w:pPr>
+        <w:pStyle w:val="Heading2"/>
+      </w:pPr>
+      <w:r>
+        <w:t xml:space="preserve">Inset an equation</w:t>
+      </w:r>
+    </w:p>
+    <w:p>
+      <w:pPr>
+        <w:pStyle w:val="FirstParagraph"/>
+      </w:pPr>
+      <m:oMathPara>
+        <m:oMathParaPr>
+          <m:jc m:val="center"/>
+        </m:oMathParaPr>
+        <m:oMath>
+          <m:r>
+            <m:t>Y</m:t>
+          </m:r>
+          <m:r>
+            <m:rPr>
+              <m:sty m:val="p"/>
+            </m:rPr>
+            <m:t>=</m:t>
+          </m:r>
+          <m:sSub>
+            <m:e>
+              <m:r>
+                <m:t>β</m:t>
+              </m:r>
+            </m:e>
+            <m:sub>
+              <m:r>
+                <m:t>0</m:t>
+              </m:r>
+            </m:sub>
+          </m:sSub>
+          <m:r>
+            <m:rPr>
+              <m:sty m:val="p"/>
+            </m:rPr>
+            <m:t>+</m:t>
+          </m:r>
+          <m:sSub>
+            <m:e>
+              <m:r>
+                <m:t>β</m:t>
+              </m:r>
+            </m:e>
+            <m:sub>
+              <m:r>
+                <m:t>1</m:t>
+              </m:r>
+            </m:sub>
+          </m:sSub>
+          <m:r>
+            <m:t>x</m:t>
+          </m:r>
+        </m:oMath>
+      </m:oMathPara>
+    </w:p>
+    <w:p>
+      <w:pPr>
+        <w:pStyle w:val="SourceCode"/>
+      </w:pPr>
+      <w:r>
+        <w:rPr>
+          <w:rStyle w:val="FunctionTok"/>
+        </w:rPr>
+        <w:t xml:space="preserve">head</w:t>
+      </w:r>
+      <w:r>
+        <w:rPr>
+          <w:rStyle w:val="NormalTok"/>
+        </w:rPr>
+        <w:t xml:space="preserve">(iris)</w:t>
+      </w:r>
+    </w:p>
+    <w:p>
+      <w:pPr>
+        <w:pStyle w:val="SourceCode"/>
+      </w:pPr>
+      <w:r>
+        <w:rPr>
+          <w:rStyle w:val="VerbatimChar"/>
+        </w:rPr>
+        <w:t xml:space="preserve">##   Sepal.Length Sepal.Width Petal.Length Petal.Width Species</w:t>
+      </w:r>
+      <w:r>
+        <w:br/>
+      </w:r>
+      <w:r>
+        <w:rPr>
+          <w:rStyle w:val="VerbatimChar"/>
+        </w:rPr>
+        <w:t xml:space="preserve">## 1          5.1         3.5          1.4         0.2  setosa</w:t>
+      </w:r>
+      <w:r>
+        <w:br/>
+      </w:r>
+      <w:r>
+        <w:rPr>
+          <w:rStyle w:val="VerbatimChar"/>
+        </w:rPr>
+        <w:t xml:space="preserve">## 2          4.9         3.0          1.4         0.2  setosa</w:t>
+      </w:r>
+      <w:r>
+        <w:br/>
+      </w:r>
+      <w:r>
+        <w:rPr>
+          <w:rStyle w:val="VerbatimChar"/>
+        </w:rPr>
+        <w:t xml:space="preserve">## 3          4.7         3.2          1.3         0.2  setosa</w:t>
+      </w:r>
+      <w:r>
+        <w:br/>
+      </w:r>
+      <w:r>
+        <w:rPr>
+          <w:rStyle w:val="VerbatimChar"/>
+        </w:rPr>
+        <w:t xml:space="preserve">## 4          4.6         3.1          1.5         0.2  setosa</w:t>
+      </w:r>
+      <w:r>
+        <w:br/>
+      </w:r>
+      <w:r>
+        <w:rPr>
+          <w:rStyle w:val="VerbatimChar"/>
+        </w:rPr>
+        <w:t xml:space="preserve">## 5          5.0         3.6          1.4         0.2  setosa</w:t>
+      </w:r>
+      <w:r>
+        <w:br/>
+      </w:r>
+      <w:r>
+        <w:rPr>
+          <w:rStyle w:val="VerbatimChar"/>
+        </w:rPr>
+        <w:t xml:space="preserve">## 6          5.4         3.9          1.7         0.4  setosa</w:t>
+      </w:r>
+    </w:p>
+    <w:p>
+      <w:pPr>
+        <w:pStyle w:val="SourceCode"/>
+      </w:pPr>
+      <w:r>
+        <w:rPr>
+          <w:rStyle w:val="CommentTok"/>
+        </w:rPr>
+        <w:t xml:space="preserve">#install.packages("printr")</w:t>
+      </w:r>
+      <w:r>
+        <w:br/>
+      </w:r>
+      <w:r>
+        <w:rPr>
+          <w:rStyle w:val="FunctionTok"/>
+        </w:rPr>
+        <w:t xml:space="preserve">library</w:t>
+      </w:r>
+      <w:r>
+        <w:rPr>
+          <w:rStyle w:val="NormalTok"/>
+        </w:rPr>
+        <w:t xml:space="preserve">(printr)</w:t>
+      </w:r>
+    </w:p>
+    <w:p>
+      <w:pPr>
+        <w:pStyle w:val="SourceCode"/>
+      </w:pPr>
+      <w:r>
+        <w:rPr>
+          <w:rStyle w:val="VerbatimChar"/>
+        </w:rPr>
+        <w:t xml:space="preserve">## Warning: package 'printr' was built under R version 4.4.3</w:t>
+      </w:r>
+    </w:p>
+    <w:p>
+      <w:pPr>
+        <w:pStyle w:val="SourceCode"/>
+      </w:pPr>
+      <w:r>
+        <w:rPr>
+          <w:rStyle w:val="VerbatimChar"/>
+        </w:rPr>
+        <w:t xml:space="preserve">## Registered S3 method overwritten by 'printr':</w:t>
+      </w:r>
+      <w:r>
+        <w:br/>
+      </w:r>
+      <w:r>
+        <w:rPr>
+          <w:rStyle w:val="VerbatimChar"/>
+        </w:rPr>
+        <w:t xml:space="preserve">##   method                from     </w:t>
+      </w:r>
+      <w:r>
+        <w:br/>
+      </w:r>
+      <w:r>
+        <w:rPr>
+          <w:rStyle w:val="VerbatimChar"/>
+        </w:rPr>
+        <w:t xml:space="preserve">##   knit_print.data.frame rmarkdown</w:t>
+      </w:r>
+    </w:p>
+    <w:p>
+      <w:pPr>
+        <w:pStyle w:val="SourceCode"/>
+      </w:pPr>
+      <w:r>
+        <w:rPr>
+          <w:rStyle w:val="FunctionTok"/>
+        </w:rPr>
+        <w:t xml:space="preserve">head</w:t>
+      </w:r>
+      <w:r>
+        <w:rPr>
+          <w:rStyle w:val="NormalTok"/>
+        </w:rPr>
+        <w:t xml:space="preserve">(iris)</w:t>
+      </w:r>
+    </w:p>
+    <w:tbl>
+      <w:tblPr>
+        <w:tblStyle w:val="Table"/>
+        <w:tblW w:type="auto" w:w="0"/>
+        <w:tblLook w:firstRow="1" w:lastRow="0" w:firstColumn="0" w:lastColumn="0" w:noHBand="0" w:noVBand="0" w:val="0020"/>
+      </w:tblPr>
+      <w:tblGrid>
+        <w:gridCol w:w="1584"/>
+        <w:gridCol w:w="1584"/>
+        <w:gridCol w:w="1584"/>
+        <w:gridCol w:w="1584"/>
+        <w:gridCol w:w="1584"/>
+      </w:tblGrid>
+      <w:tr>
+        <w:trPr>
+          <w:tblHeader w:val="on"/>
+        </w:trPr>
+        <w:tc>
+          <w:tcPr/>
+          <w:p>
+            <w:pPr>
+              <w:pStyle w:val="Compact"/>
+              <w:jc w:val="right"/>
+            </w:pPr>
+            <w:r>
+              <w:t xml:space="preserve">Sepal.Length</w:t>
+            </w:r>
+          </w:p>
+        </w:tc>
+        <w:tc>
+          <w:tcPr/>
+          <w:p>
+            <w:pPr>
+              <w:pStyle w:val="Compact"/>
+              <w:jc w:val="right"/>
+            </w:pPr>
+            <w:r>
+              <w:t xml:space="preserve">Sepal.Width</w:t>
+            </w:r>
+          </w:p>
+        </w:tc>
+        <w:tc>
+          <w:tcPr/>
+          <w:p>
+            <w:pPr>
+              <w:pStyle w:val="Compact"/>
+              <w:jc w:val="right"/>
+            </w:pPr>
+            <w:r>
+              <w:t xml:space="preserve">Petal.Length</w:t>
+            </w:r>
+          </w:p>
+        </w:tc>
+        <w:tc>
+          <w:tcPr/>
+          <w:p>
+            <w:pPr>
+              <w:pStyle w:val="Compact"/>
+              <w:jc w:val="right"/>
+            </w:pPr>
+            <w:r>
+              <w:t xml:space="preserve">Petal.Width</w:t>
+            </w:r>
+          </w:p>
+        </w:tc>
+        <w:tc>
+          <w:tcPr/>
+          <w:p>
+            <w:pPr>
+              <w:pStyle w:val="Compact"/>
+              <w:jc w:val="left"/>
+            </w:pPr>
+            <w:r>
+              <w:t xml:space="preserve">Species</w:t>
+            </w:r>
+          </w:p>
+        </w:tc>
+      </w:tr>
+      <w:tr>
+        <w:tc>
+          <w:tcPr/>
+          <w:p>
+            <w:pPr>
+              <w:pStyle w:val="Compact"/>
+              <w:jc w:val="right"/>
+            </w:pPr>
+            <w:r>
+              <w:t xml:space="preserve">5.1</w:t>
+            </w:r>
+          </w:p>
+        </w:tc>
+        <w:tc>
+          <w:tcPr/>
+          <w:p>
+            <w:pPr>
+              <w:pStyle w:val="Compact"/>
+              <w:jc w:val="right"/>
+            </w:pPr>
+            <w:r>
+              <w:t xml:space="preserve">3.5</w:t>
+            </w:r>
+          </w:p>
+        </w:tc>
+        <w:tc>
+          <w:tcPr/>
+          <w:p>
+            <w:pPr>
+              <w:pStyle w:val="Compact"/>
+              <w:jc w:val="right"/>
+            </w:pPr>
+            <w:r>
+              <w:t xml:space="preserve">1.4</w:t>
+            </w:r>
+          </w:p>
+        </w:tc>
+        <w:tc>
+          <w:tcPr/>
+          <w:p>
+            <w:pPr>
+              <w:pStyle w:val="Compact"/>
+              <w:jc w:val="right"/>
+            </w:pPr>
+            <w:r>
+              <w:t xml:space="preserve">0.2</w:t>
+            </w:r>
+          </w:p>
+        </w:tc>
+        <w:tc>
+          <w:tcPr/>
+          <w:p>
+            <w:pPr>
+              <w:pStyle w:val="Compact"/>
+              <w:jc w:val="left"/>
+            </w:pPr>
+            <w:r>
+              <w:t xml:space="preserve">setosa</w:t>
+            </w:r>
+          </w:p>
+        </w:tc>
+      </w:tr>
+      <w:tr>
+        <w:tc>
+          <w:tcPr/>
+          <w:p>
+            <w:pPr>
+              <w:pStyle w:val="Compact"/>
+              <w:jc w:val="right"/>
+            </w:pPr>
+            <w:r>
+              <w:t xml:space="preserve">4.9</w:t>
+            </w:r>
+          </w:p>
+        </w:tc>
+        <w:tc>
+          <w:tcPr/>
+          <w:p>
+            <w:pPr>
+              <w:pStyle w:val="Compact"/>
+              <w:jc w:val="right"/>
+            </w:pPr>
+            <w:r>
+              <w:t xml:space="preserve">3.0</w:t>
+            </w:r>
+          </w:p>
+        </w:tc>
+        <w:tc>
+          <w:tcPr/>
+          <w:p>
+            <w:pPr>
+              <w:pStyle w:val="Compact"/>
+              <w:jc w:val="right"/>
+            </w:pPr>
+            <w:r>
+              <w:t xml:space="preserve">1.4</w:t>
+            </w:r>
+          </w:p>
+        </w:tc>
+        <w:tc>
+          <w:tcPr/>
+          <w:p>
+            <w:pPr>
+              <w:pStyle w:val="Compact"/>
+              <w:jc w:val="right"/>
+            </w:pPr>
+            <w:r>
+              <w:t xml:space="preserve">0.2</w:t>
+            </w:r>
+          </w:p>
+        </w:tc>
+        <w:tc>
+          <w:tcPr/>
+          <w:p>
+            <w:pPr>
+              <w:pStyle w:val="Compact"/>
+              <w:jc w:val="left"/>
+            </w:pPr>
+            <w:r>
+              <w:t xml:space="preserve">setosa</w:t>
+            </w:r>
+          </w:p>
+        </w:tc>
+      </w:tr>
+      <w:tr>
+        <w:tc>
+          <w:tcPr/>
+          <w:p>
+            <w:pPr>
+              <w:pStyle w:val="Compact"/>
+              <w:jc w:val="right"/>
+            </w:pPr>
+            <w:r>
+              <w:t xml:space="preserve">4.7</w:t>
+            </w:r>
+          </w:p>
+        </w:tc>
+        <w:tc>
+          <w:tcPr/>
+          <w:p>
+            <w:pPr>
+              <w:pStyle w:val="Compact"/>
+              <w:jc w:val="right"/>
+            </w:pPr>
+            <w:r>
+              <w:t xml:space="preserve">3.2</w:t>
+            </w:r>
+          </w:p>
+        </w:tc>
+        <w:tc>
+          <w:tcPr/>
+          <w:p>
+            <w:pPr>
+              <w:pStyle w:val="Compact"/>
+              <w:jc w:val="right"/>
+            </w:pPr>
+            <w:r>
+              <w:t xml:space="preserve">1.3</w:t>
+            </w:r>
+          </w:p>
+        </w:tc>
+        <w:tc>
+          <w:tcPr/>
+          <w:p>
+            <w:pPr>
+              <w:pStyle w:val="Compact"/>
+              <w:jc w:val="right"/>
+            </w:pPr>
+            <w:r>
+              <w:t xml:space="preserve">0.2</w:t>
+            </w:r>
+          </w:p>
+        </w:tc>
+        <w:tc>
+          <w:tcPr/>
+          <w:p>
+            <w:pPr>
+              <w:pStyle w:val="Compact"/>
+              <w:jc w:val="left"/>
+            </w:pPr>
+            <w:r>
+              <w:t xml:space="preserve">setosa</w:t>
+            </w:r>
+          </w:p>
+        </w:tc>
+      </w:tr>
+      <w:tr>
+        <w:tc>
+          <w:tcPr/>
+          <w:p>
+            <w:pPr>
+              <w:pStyle w:val="Compact"/>
+              <w:jc w:val="right"/>
+            </w:pPr>
+            <w:r>
+              <w:t xml:space="preserve">4.6</w:t>
+            </w:r>
+          </w:p>
+        </w:tc>
+        <w:tc>
+          <w:tcPr/>
+          <w:p>
+            <w:pPr>
+              <w:pStyle w:val="Compact"/>
+              <w:jc w:val="right"/>
+            </w:pPr>
+            <w:r>
+              <w:t xml:space="preserve">3.1</w:t>
+            </w:r>
+          </w:p>
+        </w:tc>
+        <w:tc>
+          <w:tcPr/>
+          <w:p>
+            <w:pPr>
+              <w:pStyle w:val="Compact"/>
+              <w:jc w:val="right"/>
+            </w:pPr>
+            <w:r>
+              <w:t xml:space="preserve">1.5</w:t>
+            </w:r>
+          </w:p>
+        </w:tc>
+        <w:tc>
+          <w:tcPr/>
+          <w:p>
+            <w:pPr>
+              <w:pStyle w:val="Compact"/>
+              <w:jc w:val="right"/>
+            </w:pPr>
+            <w:r>
+              <w:t xml:space="preserve">0.2</w:t>
+            </w:r>
+          </w:p>
+        </w:tc>
+        <w:tc>
+          <w:tcPr/>
+          <w:p>
+            <w:pPr>
+              <w:pStyle w:val="Compact"/>
+              <w:jc w:val="left"/>
+            </w:pPr>
+            <w:r>
+              <w:t xml:space="preserve">setosa</w:t>
+            </w:r>
+          </w:p>
+        </w:tc>
+      </w:tr>
+      <w:tr>
+        <w:tc>
+          <w:tcPr/>
+          <w:p>
+            <w:pPr>
+              <w:pStyle w:val="Compact"/>
+              <w:jc w:val="right"/>
+            </w:pPr>
+            <w:r>
+              <w:t xml:space="preserve">5.0</w:t>
+            </w:r>
+          </w:p>
+        </w:tc>
+        <w:tc>
+          <w:tcPr/>
+          <w:p>
+            <w:pPr>
+              <w:pStyle w:val="Compact"/>
+              <w:jc w:val="right"/>
+            </w:pPr>
+            <w:r>
+              <w:t xml:space="preserve">3.6</w:t>
+            </w:r>
+          </w:p>
+        </w:tc>
+        <w:tc>
+          <w:tcPr/>
+          <w:p>
+            <w:pPr>
+              <w:pStyle w:val="Compact"/>
+              <w:jc w:val="right"/>
+            </w:pPr>
+            <w:r>
+              <w:t xml:space="preserve">1.4</w:t>
+            </w:r>
+          </w:p>
+        </w:tc>
+        <w:tc>
+          <w:tcPr/>
+          <w:p>
+            <w:pPr>
+              <w:pStyle w:val="Compact"/>
+              <w:jc w:val="right"/>
+            </w:pPr>
+            <w:r>
+              <w:t xml:space="preserve">0.2</w:t>
+            </w:r>
+          </w:p>
+        </w:tc>
+        <w:tc>
+          <w:tcPr/>
+          <w:p>
+            <w:pPr>
+              <w:pStyle w:val="Compact"/>
+              <w:jc w:val="left"/>
+            </w:pPr>
+            <w:r>
+              <w:t xml:space="preserve">setosa</w:t>
+            </w:r>
+          </w:p>
+        </w:tc>
+      </w:tr>
+      <w:tr>
+        <w:tc>
+          <w:tcPr/>
+          <w:p>
+            <w:pPr>
+              <w:pStyle w:val="Compact"/>
+              <w:jc w:val="right"/>
+            </w:pPr>
+            <w:r>
+              <w:t xml:space="preserve">5.4</w:t>
+            </w:r>
+          </w:p>
+        </w:tc>
+        <w:tc>
+          <w:tcPr/>
+          <w:p>
+            <w:pPr>
+              <w:pStyle w:val="Compact"/>
+              <w:jc w:val="right"/>
+            </w:pPr>
+            <w:r>
+              <w:t xml:space="preserve">3.9</w:t>
+            </w:r>
+          </w:p>
+        </w:tc>
+        <w:tc>
+          <w:tcPr/>
+          <w:p>
+            <w:pPr>
+              <w:pStyle w:val="Compact"/>
+              <w:jc w:val="right"/>
+            </w:pPr>
+            <w:r>
+              <w:t xml:space="preserve">1.7</w:t>
+            </w:r>
+          </w:p>
+        </w:tc>
+        <w:tc>
+          <w:tcPr/>
+          <w:p>
+            <w:pPr>
+              <w:pStyle w:val="Compact"/>
+              <w:jc w:val="right"/>
+            </w:pPr>
+            <w:r>
+              <w:t xml:space="preserve">0.4</w:t>
+            </w:r>
+          </w:p>
+        </w:tc>
+        <w:tc>
+          <w:tcPr/>
+          <w:p>
+            <w:pPr>
+              <w:pStyle w:val="Compact"/>
+              <w:jc w:val="left"/>
+            </w:pPr>
+            <w:r>
+              <w:t xml:space="preserve">setosa</w:t>
+            </w:r>
+          </w:p>
+        </w:tc>
+      </w:tr>
+    </w:tbl>
     <w:bookmarkEnd w:id="23"/>
+    <w:bookmarkStart w:id="27" w:name="insert-an-image"/>
+    <w:p>
+      <w:pPr>
+        <w:pStyle w:val="Heading2"/>
+      </w:pPr>
+      <w:r>
+        <w:t xml:space="preserve">Insert an image</w:t>
+      </w:r>
+    </w:p>
+    <w:p>
+      <w:pPr>
+        <w:pStyle w:val="FirstParagraph"/>
+      </w:pPr>
+      <w:r>
+        <w:t xml:space="preserve">Here is an image inserted</w:t>
+      </w:r>
+    </w:p>
+    <w:p>
+      <w:pPr>
+        <w:pStyle w:val="CaptionedFigure"/>
+      </w:pPr>
+      <w:r>
+        <w:drawing>
+          <wp:inline>
+            <wp:extent cx="1776138" cy="1733051"/>
+            <wp:effectExtent b="0" l="0" r="0" t="0"/>
+            <wp:docPr descr="Sunstar" title="" id="25" name="Picture"/>
+            <a:graphic>
+              <a:graphicData uri="http://schemas.openxmlformats.org/drawingml/2006/picture">
+                <pic:pic>
+                  <pic:nvPicPr>
+                    <pic:cNvPr descr="Sunstar/sunstar.png" id="26" name="Picture"/>
+                    <pic:cNvPicPr>
+                      <a:picLocks noChangeArrowheads="1" noChangeAspect="1"/>
+                    </pic:cNvPicPr>
+                  </pic:nvPicPr>
+                  <pic:blipFill>
+                    <a:blip r:embed="rId24"/>
+                    <a:stretch>
+                      <a:fillRect/>
+                    </a:stretch>
+                  </pic:blipFill>
+                  <pic:spPr bwMode="auto">
+                    <a:xfrm>
+                      <a:off x="0" y="0"/>
+                      <a:ext cx="1776138" cy="1733051"/>
+                    </a:xfrm>
+                    <a:prstGeom prst="rect">
+                      <a:avLst/>
+                    </a:prstGeom>
+                    <a:noFill/>
+                    <a:ln w="9525">
+                      <a:noFill/>
+                      <a:headEnd/>
+                      <a:tailEnd/>
+                    </a:ln>
+                  </pic:spPr>
+                </pic:pic>
+              </a:graphicData>
+            </a:graphic>
+          </wp:inline>
+        </w:drawing>
+      </w:r>
+    </w:p>
+    <w:p>
+      <w:pPr>
+        <w:pStyle w:val="ImageCaption"/>
+      </w:pPr>
+      <w:r>
+        <w:t xml:space="preserve">Sunstar</w:t>
+      </w:r>
+    </w:p>
+    <w:bookmarkEnd w:id="27"/>
+    <w:bookmarkStart w:id="29" w:name="insert-a-foot-note"/>
+    <w:p>
+      <w:pPr>
+        <w:pStyle w:val="Heading2"/>
+      </w:pPr>
+      <w:r>
+        <w:t xml:space="preserve">Insert a foot note</w:t>
+      </w:r>
+    </w:p>
+    <w:p>
+      <w:pPr>
+        <w:pStyle w:val="FirstParagraph"/>
+      </w:pPr>
+      <w:r>
+        <w:t xml:space="preserve">Here is a footnote</w:t>
+      </w:r>
+      <w:r>
+        <w:rPr>
+          <w:rStyle w:val="FootnoteReference"/>
+        </w:rPr>
+        <w:footnoteReference w:id="28"/>
+      </w:r>
+    </w:p>
+    <w:bookmarkEnd w:id="29"/>
+    <w:bookmarkEnd w:id="30"/>
     <w:sectPr>
       <w:footnotePr>
         <w:numRestart w:val="eachSect"/>
@@ -957,6 +1776,25 @@
     <w:p>
       <w:r>
         <w:separator/>
+      </w:r>
+    </w:p>
+  </w:footnote>
+  <w:footnote w:id="28">
+    <w:p>
+      <w:pPr>
+        <w:pStyle w:val="FootnoteText"/>
+      </w:pPr>
+      <w:r>
+        <w:rPr>
+          <w:rStyle w:val="FootnoteReference"/>
+        </w:rPr>
+        <w:footnoteRef/>
+      </w:r>
+      <w:r>
+        <w:t xml:space="preserve"> </w:t>
+      </w:r>
+      <w:r>
+        <w:t xml:space="preserve">This is an inline footnote which is easier since you don’t have to remember going to edit the end of the document</w:t>
       </w:r>
     </w:p>
   </w:footnote>

</xml_diff>